<commit_message>
Align weekly status report wording with shared text version
Co-Authored-By: Claude Opus 5.5 <noreply@anthropic.com>
Claude-Session: https://claude.ai/code/session_0128GGMJqj1fgFawc5fV1mHg
</commit_message>
<xml_diff>
--- a/reports/Weekly_Status_Report_2026-10-07.docx
+++ b/reports/Weekly_Status_Report_2026-10-07.docx
@@ -164,7 +164,7 @@
         <w:spacing w:after="0"/>
       </w:pPr>
       <w:r>
-        <w:t>New scope (Marketplace v1.3, due 15 Oct): RMA item-level "Decision Pending" sub-status (MT-1540), Privacy compliance (MT-1553), Security assessment (MT-1547), Functional smoke regression (MT-1541); Live chat widget (MT-1577) added.</w:t>
+        <w:t>New scope (Marketplace v1.3, due 15 Oct): RMA item-level "Decision Pending" sub-status (MT-1540), Privacy compliance (MT-1553), Security assessment (MT-1547), Functional smoke regression (MT-1541). A live chat widget (MT-1577) has also been added, with no due date set.</w:t>
       </w:r>
     </w:p>
     <w:p>
@@ -6195,7 +6195,7 @@
               <w:rPr>
                 <w:sz w:val="18"/>
               </w:rPr>
-              <w:t>5 field-validation tickets Ready for Prod since 30 Sep (ID-696–699, ID-710)</w:t>
+              <w:t>5 field-validation tickets Ready for Prod (ID-696–699 due 30 Sep, ID-710 no due date)</w:t>
             </w:r>
           </w:p>
         </w:tc>

</xml_diff>